<commit_message>
fix: LibreOffice reads back what both exporters write
A section opening on a side hands its one-page master over to a follow-up
master instead of asking for a right-only page, which doubled the page count.
DOCX names its default style Normal and marks it as the default, zone tabs
stay tabs, footnote numbering rides in the section properties, and w:position
counts half-points. The importer keeps content controls, shape text boxes and
index page numbers, and opens no phantom section on the leading master.
Editing rejects the nesting the formats cannot hold, note repairs ride the
undo history, and the showcase files are rebuilt.
</commit_message>
<xml_diff>
--- a/docs/showcase/book.docx
+++ b/docs/showcase/book.docx
@@ -45,6 +45,18 @@
     <w:p>
       <w:pPr>
         <w:sectPr>
+          <w:footnotePr>
+            <w:pos w:val="pageBottom"/>
+            <w:numFmt w:val="decimal"/>
+            <w:numStart w:val="1"/>
+            <w:numRestart w:val="continuous"/>
+          </w:footnotePr>
+          <w:endnotePr>
+            <w:pos w:val="docEnd"/>
+            <w:numFmt w:val="lowerRoman"/>
+            <w:numStart w:val="1"/>
+            <w:numRestart w:val="continuous"/>
+          </w:endnotePr>
           <w:pgSz w:w="8391" w:h="11906" w:orient="portrait"/>
           <w:pgMar w:top="1134" w:right="907" w:bottom="1247" w:left="1247" w:header="680" w:footer="680" w:gutter="0"/>
           <w:pgNumType/>
@@ -493,10 +505,22 @@
           <w:footerReference w:type="default" r:id="rId10"/>
           <w:footerReference w:type="first" r:id="rId11"/>
           <w:footerReference w:type="even" r:id="rId12"/>
+          <w:footnotePr>
+            <w:pos w:val="pageBottom"/>
+            <w:numFmt w:val="decimal"/>
+            <w:numStart w:val="1"/>
+            <w:numRestart w:val="continuous"/>
+          </w:footnotePr>
+          <w:endnotePr>
+            <w:pos w:val="docEnd"/>
+            <w:numFmt w:val="lowerRoman"/>
+            <w:numStart w:val="1"/>
+            <w:numRestart w:val="continuous"/>
+          </w:endnotePr>
           <w:type w:val="oddPage"/>
           <w:pgSz w:w="8391" w:h="11906" w:orient="portrait"/>
           <w:pgMar w:top="1134" w:right="907" w:bottom="1247" w:left="1247" w:header="680" w:footer="680" w:gutter="0"/>
-          <w:pgNumType w:start="1"/>
+          <w:pgNumType w:start="1" w:fmt="decimal"/>
           <w:titlePg/>
           <w:docGrid w:linePitch="360"/>
         </w:sectPr>
@@ -927,6 +951,18 @@
           <w:footerReference w:type="default" r:id="rId16"/>
           <w:footerReference w:type="first" r:id="rId17"/>
           <w:footerReference w:type="even" r:id="rId18"/>
+          <w:footnotePr>
+            <w:pos w:val="pageBottom"/>
+            <w:numFmt w:val="decimal"/>
+            <w:numStart w:val="1"/>
+            <w:numRestart w:val="continuous"/>
+          </w:footnotePr>
+          <w:endnotePr>
+            <w:pos w:val="docEnd"/>
+            <w:numFmt w:val="lowerRoman"/>
+            <w:numStart w:val="1"/>
+            <w:numRestart w:val="continuous"/>
+          </w:endnotePr>
           <w:type w:val="oddPage"/>
           <w:pgSz w:w="8391" w:h="11906" w:orient="portrait"/>
           <w:pgMar w:top="1134" w:right="907" w:bottom="1247" w:left="1247" w:header="680" w:footer="680" w:gutter="0"/>
@@ -1558,6 +1594,18 @@
           <w:footerReference w:type="default" r:id="rId22"/>
           <w:footerReference w:type="first" r:id="rId23"/>
           <w:footerReference w:type="even" r:id="rId24"/>
+          <w:footnotePr>
+            <w:pos w:val="pageBottom"/>
+            <w:numFmt w:val="decimal"/>
+            <w:numStart w:val="1"/>
+            <w:numRestart w:val="continuous"/>
+          </w:footnotePr>
+          <w:endnotePr>
+            <w:pos w:val="docEnd"/>
+            <w:numFmt w:val="lowerRoman"/>
+            <w:numStart w:val="1"/>
+            <w:numRestart w:val="continuous"/>
+          </w:endnotePr>
           <w:type w:val="oddPage"/>
           <w:pgSz w:w="8391" w:h="11906" w:orient="portrait"/>
           <w:pgMar w:top="1134" w:right="907" w:bottom="1247" w:left="1247" w:header="680" w:footer="680" w:gutter="0"/>
@@ -2190,6 +2238,18 @@
           <w:footerReference w:type="default" r:id="rId28"/>
           <w:footerReference w:type="first" r:id="rId29"/>
           <w:footerReference w:type="even" r:id="rId30"/>
+          <w:footnotePr>
+            <w:pos w:val="pageBottom"/>
+            <w:numFmt w:val="decimal"/>
+            <w:numStart w:val="1"/>
+            <w:numRestart w:val="continuous"/>
+          </w:footnotePr>
+          <w:endnotePr>
+            <w:pos w:val="docEnd"/>
+            <w:numFmt w:val="lowerRoman"/>
+            <w:numStart w:val="1"/>
+            <w:numRestart w:val="continuous"/>
+          </w:endnotePr>
           <w:type w:val="oddPage"/>
           <w:pgSz w:w="8391" w:h="11906" w:orient="portrait"/>
           <w:pgMar w:top="1134" w:right="907" w:bottom="1247" w:left="1247" w:header="680" w:footer="680" w:gutter="0"/>
@@ -3199,6 +3259,18 @@
           <w:footerReference w:type="default" r:id="rId34"/>
           <w:footerReference w:type="first" r:id="rId35"/>
           <w:footerReference w:type="even" r:id="rId36"/>
+          <w:footnotePr>
+            <w:pos w:val="pageBottom"/>
+            <w:numFmt w:val="decimal"/>
+            <w:numStart w:val="1"/>
+            <w:numRestart w:val="continuous"/>
+          </w:footnotePr>
+          <w:endnotePr>
+            <w:pos w:val="docEnd"/>
+            <w:numFmt w:val="lowerRoman"/>
+            <w:numStart w:val="1"/>
+            <w:numRestart w:val="continuous"/>
+          </w:endnotePr>
           <w:type w:val="oddPage"/>
           <w:pgSz w:w="8391" w:h="11906" w:orient="portrait"/>
           <w:pgMar w:top="1134" w:right="907" w:bottom="1247" w:left="1247" w:header="680" w:footer="680" w:gutter="0"/>
@@ -4143,6 +4215,18 @@
           <w:footerReference w:type="default" r:id="rId40"/>
           <w:footerReference w:type="first" r:id="rId41"/>
           <w:footerReference w:type="even" r:id="rId42"/>
+          <w:footnotePr>
+            <w:pos w:val="pageBottom"/>
+            <w:numFmt w:val="decimal"/>
+            <w:numStart w:val="1"/>
+            <w:numRestart w:val="continuous"/>
+          </w:footnotePr>
+          <w:endnotePr>
+            <w:pos w:val="docEnd"/>
+            <w:numFmt w:val="lowerRoman"/>
+            <w:numStart w:val="1"/>
+            <w:numRestart w:val="continuous"/>
+          </w:endnotePr>
           <w:type w:val="oddPage"/>
           <w:pgSz w:w="8391" w:h="11906" w:orient="portrait"/>
           <w:pgMar w:top="1134" w:right="907" w:bottom="1247" w:left="1247" w:header="680" w:footer="680" w:gutter="0"/>
@@ -5332,6 +5416,18 @@
           <w:footerReference w:type="default" r:id="rId46"/>
           <w:footerReference w:type="first" r:id="rId47"/>
           <w:footerReference w:type="even" r:id="rId48"/>
+          <w:footnotePr>
+            <w:pos w:val="pageBottom"/>
+            <w:numFmt w:val="decimal"/>
+            <w:numStart w:val="1"/>
+            <w:numRestart w:val="continuous"/>
+          </w:footnotePr>
+          <w:endnotePr>
+            <w:pos w:val="docEnd"/>
+            <w:numFmt w:val="lowerRoman"/>
+            <w:numStart w:val="1"/>
+            <w:numRestart w:val="continuous"/>
+          </w:endnotePr>
           <w:type w:val="oddPage"/>
           <w:pgSz w:w="8391" w:h="11906" w:orient="portrait"/>
           <w:pgMar w:top="1134" w:right="907" w:bottom="1247" w:left="1247" w:header="680" w:footer="680" w:gutter="0"/>
@@ -6135,6 +6231,18 @@
           <w:footerReference w:type="default" r:id="rId52"/>
           <w:footerReference w:type="first" r:id="rId53"/>
           <w:footerReference w:type="even" r:id="rId54"/>
+          <w:footnotePr>
+            <w:pos w:val="pageBottom"/>
+            <w:numFmt w:val="decimal"/>
+            <w:numStart w:val="1"/>
+            <w:numRestart w:val="continuous"/>
+          </w:footnotePr>
+          <w:endnotePr>
+            <w:pos w:val="docEnd"/>
+            <w:numFmt w:val="lowerRoman"/>
+            <w:numStart w:val="1"/>
+            <w:numRestart w:val="continuous"/>
+          </w:endnotePr>
           <w:type w:val="oddPage"/>
           <w:pgSz w:w="8391" w:h="11906" w:orient="portrait"/>
           <w:pgMar w:top="1134" w:right="907" w:bottom="1247" w:left="1247" w:header="680" w:footer="680" w:gutter="0"/>
@@ -7177,6 +7285,18 @@
           <w:footerReference w:type="default" r:id="rId58"/>
           <w:footerReference w:type="first" r:id="rId59"/>
           <w:footerReference w:type="even" r:id="rId60"/>
+          <w:footnotePr>
+            <w:pos w:val="pageBottom"/>
+            <w:numFmt w:val="decimal"/>
+            <w:numStart w:val="1"/>
+            <w:numRestart w:val="continuous"/>
+          </w:footnotePr>
+          <w:endnotePr>
+            <w:pos w:val="docEnd"/>
+            <w:numFmt w:val="lowerRoman"/>
+            <w:numStart w:val="1"/>
+            <w:numRestart w:val="continuous"/>
+          </w:endnotePr>
           <w:type w:val="oddPage"/>
           <w:pgSz w:w="8391" w:h="11906" w:orient="portrait"/>
           <w:pgMar w:top="1134" w:right="907" w:bottom="1247" w:left="1247" w:header="680" w:footer="680" w:gutter="0"/>
@@ -8130,6 +8250,18 @@
           <w:footerReference w:type="default" r:id="rId64"/>
           <w:footerReference w:type="first" r:id="rId65"/>
           <w:footerReference w:type="even" r:id="rId66"/>
+          <w:footnotePr>
+            <w:pos w:val="pageBottom"/>
+            <w:numFmt w:val="decimal"/>
+            <w:numStart w:val="1"/>
+            <w:numRestart w:val="continuous"/>
+          </w:footnotePr>
+          <w:endnotePr>
+            <w:pos w:val="docEnd"/>
+            <w:numFmt w:val="lowerRoman"/>
+            <w:numStart w:val="1"/>
+            <w:numRestart w:val="continuous"/>
+          </w:endnotePr>
           <w:type w:val="oddPage"/>
           <w:pgSz w:w="8391" w:h="11906" w:orient="portrait"/>
           <w:pgMar w:top="1134" w:right="907" w:bottom="1247" w:left="1247" w:header="680" w:footer="680" w:gutter="0"/>
@@ -8970,6 +9102,18 @@
           <w:footerReference w:type="default" r:id="rId70"/>
           <w:footerReference w:type="first" r:id="rId71"/>
           <w:footerReference w:type="even" r:id="rId72"/>
+          <w:footnotePr>
+            <w:pos w:val="pageBottom"/>
+            <w:numFmt w:val="decimal"/>
+            <w:numStart w:val="1"/>
+            <w:numRestart w:val="continuous"/>
+          </w:footnotePr>
+          <w:endnotePr>
+            <w:pos w:val="docEnd"/>
+            <w:numFmt w:val="lowerRoman"/>
+            <w:numStart w:val="1"/>
+            <w:numRestart w:val="continuous"/>
+          </w:endnotePr>
           <w:type w:val="oddPage"/>
           <w:pgSz w:w="8391" w:h="11906" w:orient="portrait"/>
           <w:pgMar w:top="1134" w:right="907" w:bottom="1247" w:left="1247" w:header="680" w:footer="680" w:gutter="0"/>
@@ -9881,6 +10025,18 @@
       <w:footerReference w:type="default" r:id="rId76"/>
       <w:footerReference w:type="first" r:id="rId77"/>
       <w:footerReference w:type="even" r:id="rId78"/>
+      <w:footnotePr>
+        <w:pos w:val="pageBottom"/>
+        <w:numFmt w:val="decimal"/>
+        <w:numStart w:val="1"/>
+        <w:numRestart w:val="continuous"/>
+      </w:footnotePr>
+      <w:endnotePr>
+        <w:pos w:val="docEnd"/>
+        <w:numFmt w:val="lowerRoman"/>
+        <w:numStart w:val="1"/>
+        <w:numRestart w:val="continuous"/>
+      </w:endnotePr>
       <w:type w:val="oddPage"/>
       <w:pgSz w:w="8391" w:h="11906" w:orient="portrait"/>
       <w:pgMar w:top="1134" w:right="907" w:bottom="1247" w:left="1247" w:header="680" w:footer="680" w:gutter="0"/>
@@ -9956,6 +10112,7 @@
       <w:fldChar w:fldCharType="begin"/>
       <w:instrText xml:space="preserve">PAGE</w:instrText>
       <w:fldChar w:fldCharType="separate"/>
+      <w:t>1</w:t>
       <w:fldChar w:fldCharType="end"/>
     </w:r>
   </w:p>
@@ -9985,6 +10142,7 @@
       <w:fldChar w:fldCharType="begin"/>
       <w:instrText xml:space="preserve">PAGE</w:instrText>
       <w:fldChar w:fldCharType="separate"/>
+      <w:t>1</w:t>
       <w:fldChar w:fldCharType="end"/>
     </w:r>
   </w:p>
@@ -10014,6 +10172,7 @@
       <w:fldChar w:fldCharType="begin"/>
       <w:instrText xml:space="preserve">PAGE</w:instrText>
       <w:fldChar w:fldCharType="separate"/>
+      <w:t>1</w:t>
       <w:fldChar w:fldCharType="end"/>
     </w:r>
   </w:p>
@@ -10043,6 +10202,7 @@
       <w:fldChar w:fldCharType="begin"/>
       <w:instrText xml:space="preserve">PAGE</w:instrText>
       <w:fldChar w:fldCharType="separate"/>
+      <w:t>1</w:t>
       <w:fldChar w:fldCharType="end"/>
     </w:r>
   </w:p>
@@ -10060,6 +10220,7 @@
       <w:fldChar w:fldCharType="begin"/>
       <w:instrText xml:space="preserve">PAGE</w:instrText>
       <w:fldChar w:fldCharType="separate"/>
+      <w:t>1</w:t>
       <w:fldChar w:fldCharType="end"/>
     </w:r>
   </w:p>
@@ -10089,6 +10250,7 @@
       <w:fldChar w:fldCharType="begin"/>
       <w:instrText xml:space="preserve">PAGE</w:instrText>
       <w:fldChar w:fldCharType="separate"/>
+      <w:t>1</w:t>
       <w:fldChar w:fldCharType="end"/>
     </w:r>
   </w:p>
@@ -10118,6 +10280,7 @@
       <w:fldChar w:fldCharType="begin"/>
       <w:instrText xml:space="preserve">PAGE</w:instrText>
       <w:fldChar w:fldCharType="separate"/>
+      <w:t>1</w:t>
       <w:fldChar w:fldCharType="end"/>
     </w:r>
   </w:p>
@@ -10147,6 +10310,7 @@
       <w:fldChar w:fldCharType="begin"/>
       <w:instrText xml:space="preserve">PAGE</w:instrText>
       <w:fldChar w:fldCharType="separate"/>
+      <w:t>1</w:t>
       <w:fldChar w:fldCharType="end"/>
     </w:r>
   </w:p>
@@ -10182,6 +10346,7 @@
       <w:fldChar w:fldCharType="begin"/>
       <w:instrText xml:space="preserve">PAGE</w:instrText>
       <w:fldChar w:fldCharType="separate"/>
+      <w:t>1</w:t>
       <w:fldChar w:fldCharType="end"/>
     </w:r>
   </w:p>
@@ -10211,6 +10376,7 @@
       <w:fldChar w:fldCharType="begin"/>
       <w:instrText xml:space="preserve">PAGE</w:instrText>
       <w:fldChar w:fldCharType="separate"/>
+      <w:t>1</w:t>
       <w:fldChar w:fldCharType="end"/>
     </w:r>
   </w:p>
@@ -10240,6 +10406,7 @@
       <w:fldChar w:fldCharType="begin"/>
       <w:instrText xml:space="preserve">PAGE</w:instrText>
       <w:fldChar w:fldCharType="separate"/>
+      <w:t>1</w:t>
       <w:fldChar w:fldCharType="end"/>
     </w:r>
   </w:p>
@@ -10269,6 +10436,7 @@
       <w:fldChar w:fldCharType="begin"/>
       <w:instrText xml:space="preserve">PAGE</w:instrText>
       <w:fldChar w:fldCharType="separate"/>
+      <w:t>1</w:t>
       <w:fldChar w:fldCharType="end"/>
     </w:r>
   </w:p>
@@ -10339,6 +10507,7 @@
       <w:fldChar w:fldCharType="begin"/>
       <w:instrText xml:space="preserve">PAGE</w:instrText>
       <w:fldChar w:fldCharType="separate"/>
+      <w:t>1</w:t>
       <w:fldChar w:fldCharType="end"/>
     </w:r>
   </w:p>
@@ -10366,6 +10535,7 @@
       <w:fldChar w:fldCharType="begin"/>
       <w:instrText xml:space="preserve">PAGE</w:instrText>
       <w:fldChar w:fldCharType="separate"/>
+      <w:t>1</w:t>
       <w:fldChar w:fldCharType="end"/>
     </w:r>
   </w:p>
@@ -10391,6 +10561,7 @@
       <w:fldChar w:fldCharType="begin"/>
       <w:instrText xml:space="preserve">PAGE</w:instrText>
       <w:fldChar w:fldCharType="separate"/>
+      <w:t>1</w:t>
       <w:fldChar w:fldCharType="end"/>
     </w:r>
     <w:r>
@@ -10428,6 +10599,7 @@
       <w:fldChar w:fldCharType="begin"/>
       <w:instrText xml:space="preserve">PAGE</w:instrText>
       <w:fldChar w:fldCharType="separate"/>
+      <w:t>1</w:t>
       <w:fldChar w:fldCharType="end"/>
     </w:r>
   </w:p>
@@ -10453,6 +10625,7 @@
       <w:fldChar w:fldCharType="begin"/>
       <w:instrText xml:space="preserve">PAGE</w:instrText>
       <w:fldChar w:fldCharType="separate"/>
+      <w:t>1</w:t>
       <w:fldChar w:fldCharType="end"/>
     </w:r>
     <w:r>
@@ -10490,6 +10663,7 @@
       <w:fldChar w:fldCharType="begin"/>
       <w:instrText xml:space="preserve">PAGE</w:instrText>
       <w:fldChar w:fldCharType="separate"/>
+      <w:t>1</w:t>
       <w:fldChar w:fldCharType="end"/>
     </w:r>
   </w:p>
@@ -10515,6 +10689,7 @@
       <w:fldChar w:fldCharType="begin"/>
       <w:instrText xml:space="preserve">PAGE</w:instrText>
       <w:fldChar w:fldCharType="separate"/>
+      <w:t>1</w:t>
       <w:fldChar w:fldCharType="end"/>
     </w:r>
     <w:r>
@@ -10552,6 +10727,7 @@
       <w:fldChar w:fldCharType="begin"/>
       <w:instrText xml:space="preserve">PAGE</w:instrText>
       <w:fldChar w:fldCharType="separate"/>
+      <w:t>1</w:t>
       <w:fldChar w:fldCharType="end"/>
     </w:r>
   </w:p>
@@ -10583,6 +10759,7 @@
       <w:fldChar w:fldCharType="begin"/>
       <w:instrText xml:space="preserve">PAGE</w:instrText>
       <w:fldChar w:fldCharType="separate"/>
+      <w:t>1</w:t>
       <w:fldChar w:fldCharType="end"/>
     </w:r>
     <w:r>
@@ -10620,6 +10797,7 @@
       <w:fldChar w:fldCharType="begin"/>
       <w:instrText xml:space="preserve">PAGE</w:instrText>
       <w:fldChar w:fldCharType="separate"/>
+      <w:t>1</w:t>
       <w:fldChar w:fldCharType="end"/>
     </w:r>
   </w:p>
@@ -10645,6 +10823,7 @@
       <w:fldChar w:fldCharType="begin"/>
       <w:instrText xml:space="preserve">PAGE</w:instrText>
       <w:fldChar w:fldCharType="separate"/>
+      <w:t>1</w:t>
       <w:fldChar w:fldCharType="end"/>
     </w:r>
     <w:r>
@@ -10682,6 +10861,7 @@
       <w:fldChar w:fldCharType="begin"/>
       <w:instrText xml:space="preserve">PAGE</w:instrText>
       <w:fldChar w:fldCharType="separate"/>
+      <w:t>1</w:t>
       <w:fldChar w:fldCharType="end"/>
     </w:r>
   </w:p>
@@ -10707,6 +10887,7 @@
       <w:fldChar w:fldCharType="begin"/>
       <w:instrText xml:space="preserve">PAGE</w:instrText>
       <w:fldChar w:fldCharType="separate"/>
+      <w:t>1</w:t>
       <w:fldChar w:fldCharType="end"/>
     </w:r>
     <w:r>
@@ -10744,6 +10925,7 @@
       <w:fldChar w:fldCharType="begin"/>
       <w:instrText xml:space="preserve">PAGE</w:instrText>
       <w:fldChar w:fldCharType="separate"/>
+      <w:t>1</w:t>
       <w:fldChar w:fldCharType="end"/>
     </w:r>
   </w:p>
@@ -10769,6 +10951,7 @@
       <w:fldChar w:fldCharType="begin"/>
       <w:instrText xml:space="preserve">PAGE</w:instrText>
       <w:fldChar w:fldCharType="separate"/>
+      <w:t>1</w:t>
       <w:fldChar w:fldCharType="end"/>
     </w:r>
     <w:r>
@@ -10798,6 +10981,7 @@
       <w:fldChar w:fldCharType="begin"/>
       <w:instrText xml:space="preserve">PAGE</w:instrText>
       <w:fldChar w:fldCharType="separate"/>
+      <w:t>1</w:t>
       <w:fldChar w:fldCharType="end"/>
     </w:r>
     <w:r>
@@ -10835,6 +11019,7 @@
       <w:fldChar w:fldCharType="begin"/>
       <w:instrText xml:space="preserve">PAGE</w:instrText>
       <w:fldChar w:fldCharType="separate"/>
+      <w:t>1</w:t>
       <w:fldChar w:fldCharType="end"/>
     </w:r>
   </w:p>
@@ -10860,6 +11045,7 @@
       <w:fldChar w:fldCharType="begin"/>
       <w:instrText xml:space="preserve">PAGE</w:instrText>
       <w:fldChar w:fldCharType="separate"/>
+      <w:t>1</w:t>
       <w:fldChar w:fldCharType="end"/>
     </w:r>
     <w:r>
@@ -10897,6 +11083,7 @@
       <w:fldChar w:fldCharType="begin"/>
       <w:instrText xml:space="preserve">PAGE</w:instrText>
       <w:fldChar w:fldCharType="separate"/>
+      <w:t>1</w:t>
       <w:fldChar w:fldCharType="end"/>
     </w:r>
   </w:p>
@@ -10922,6 +11109,7 @@
       <w:fldChar w:fldCharType="begin"/>
       <w:instrText xml:space="preserve">PAGE</w:instrText>
       <w:fldChar w:fldCharType="separate"/>
+      <w:t>1</w:t>
       <w:fldChar w:fldCharType="end"/>
     </w:r>
     <w:r>
@@ -10959,6 +11147,7 @@
       <w:fldChar w:fldCharType="begin"/>
       <w:instrText xml:space="preserve">PAGE</w:instrText>
       <w:fldChar w:fldCharType="separate"/>
+      <w:t>1</w:t>
       <w:fldChar w:fldCharType="end"/>
     </w:r>
   </w:p>
@@ -10984,6 +11173,7 @@
       <w:fldChar w:fldCharType="begin"/>
       <w:instrText xml:space="preserve">PAGE</w:instrText>
       <w:fldChar w:fldCharType="separate"/>
+      <w:t>1</w:t>
       <w:fldChar w:fldCharType="end"/>
     </w:r>
     <w:r>
@@ -11021,6 +11211,7 @@
       <w:fldChar w:fldCharType="begin"/>
       <w:instrText xml:space="preserve">PAGE</w:instrText>
       <w:fldChar w:fldCharType="separate"/>
+      <w:t>1</w:t>
       <w:fldChar w:fldCharType="end"/>
     </w:r>
   </w:p>
@@ -11046,6 +11237,7 @@
       <w:fldChar w:fldCharType="begin"/>
       <w:instrText xml:space="preserve">PAGE</w:instrText>
       <w:fldChar w:fldCharType="separate"/>
+      <w:t>1</w:t>
       <w:fldChar w:fldCharType="end"/>
     </w:r>
     <w:r>
@@ -11198,7 +11390,7 @@
     <w:qFormat/>
     <w:pPr>
       <w:keepNext/>
-      <w:spacing w:after="600" w:before="0" w:line="240" w:lineRule="auto"/>
+      <w:spacing w:after="600" w:before="0"/>
       <w:jc w:val="center"/>
     </w:pPr>
     <w:rPr>
@@ -11387,8 +11579,8 @@
       <w:szCs w:val="20"/>
     </w:rPr>
   </w:style>
-  <w:style w:type="paragraph" w:styleId="Normal">
-    <w:name w:val="Standard"/>
+  <w:style w:type="paragraph" w:default="1" w:styleId="Normal">
+    <w:name w:val="Normal"/>
     <w:qFormat/>
     <w:pPr>
       <w:spacing w:after="0" w:line="300" w:lineRule="auto"/>
@@ -11407,7 +11599,7 @@
     <w:next w:val="Normal"/>
     <w:qFormat/>
     <w:pPr>
-      <w:spacing w:after="120" w:before="240" w:line="240" w:lineRule="auto"/>
+      <w:spacing w:after="120" w:before="240"/>
     </w:pPr>
     <w:rPr>
       <w:rFonts w:ascii="Arial" w:cs="Arial" w:eastAsia="Arial" w:hAnsi="Arial"/>
@@ -11501,7 +11693,7 @@
     <w:next w:val="Normal"/>
     <w:qFormat/>
     <w:pPr>
-      <w:spacing w:after="280" w:line="240" w:lineRule="auto"/>
+      <w:spacing w:after="280"/>
       <w:ind w:left="567"/>
     </w:pPr>
     <w:rPr>
@@ -11514,7 +11706,7 @@
     <w:next w:val="Caption"/>
     <w:qFormat/>
     <w:pPr>
-      <w:spacing w:after="120" w:before="120" w:line="240" w:lineRule="auto"/>
+      <w:spacing w:after="120" w:before="120"/>
     </w:pPr>
     <w:rPr>
       <w:i/>
@@ -11530,7 +11722,7 @@
     <w:next w:val="Heading1"/>
     <w:qFormat/>
     <w:pPr>
-      <w:spacing w:after="80" w:before="1680" w:line="240" w:lineRule="auto"/>
+      <w:spacing w:after="80" w:before="1680"/>
       <w:jc w:val="center"/>
     </w:pPr>
     <w:rPr>
@@ -11545,7 +11737,7 @@
     <w:next w:val="Normal"/>
     <w:qFormat/>
     <w:pPr>
-      <w:spacing w:after="120" w:before="120" w:line="240" w:lineRule="auto"/>
+      <w:spacing w:after="120" w:before="120"/>
       <w:ind w:left="850"/>
       <w:jc w:val="left"/>
     </w:pPr>
@@ -11559,7 +11751,7 @@
     <w:next w:val="Normal"/>
     <w:qFormat/>
     <w:pPr>
-      <w:spacing w:after="480" w:before="1680" w:line="240" w:lineRule="auto"/>
+      <w:spacing w:after="480" w:before="1680"/>
     </w:pPr>
     <w:rPr>
       <w:kern w:val="1"/>

</xml_diff>

<commit_message>
docs: the showcase documents vary their running heads
The book carries the chapter and the title towards the outer edge and its page
number centred at the foot; the newsletter opens with the masthead and runs a
head with a rule from the second page on. The thesis keeps chapter and number
in the head, so the three read as three page designs.
</commit_message>
<xml_diff>
--- a/docs/showcase/book.docx
+++ b/docs/showcase/book.docx
@@ -10091,13 +10091,37 @@
 
 <file path=word/footer1.xml><?xml version="1.0" encoding="utf-8"?>
 <w:ftr xmlns:wpc="http://schemas.microsoft.com/office/word/2010/wordprocessingCanvas" xmlns:mc="http://schemas.openxmlformats.org/markup-compatibility/2006" xmlns:o="urn:schemas-microsoft-com:office:office" xmlns:r="http://schemas.openxmlformats.org/officeDocument/2006/relationships" xmlns:m="http://schemas.openxmlformats.org/officeDocument/2006/math" xmlns:v="urn:schemas-microsoft-com:vml" xmlns:wp14="http://schemas.microsoft.com/office/word/2010/wordprocessingDrawing" xmlns:wp="http://schemas.openxmlformats.org/drawingml/2006/wordprocessingDrawing" xmlns:w10="urn:schemas-microsoft-com:office:word" xmlns:w="http://schemas.openxmlformats.org/wordprocessingml/2006/main" xmlns:w14="http://schemas.microsoft.com/office/word/2010/wordml" xmlns:w15="http://schemas.microsoft.com/office/word/2012/wordml" xmlns:wpg="http://schemas.microsoft.com/office/word/2010/wordprocessingGroup" xmlns:wpi="http://schemas.microsoft.com/office/word/2010/wordprocessingInk" xmlns:wne="http://schemas.microsoft.com/office/word/2006/wordml" xmlns:wps="http://schemas.microsoft.com/office/word/2010/wordprocessingShape">
-  <w:p/>
+  <w:p>
+    <w:pPr>
+      <w:pStyle w:val="Normal"/>
+      <w:jc w:val="center"/>
+    </w:pPr>
+    <w:r>
+      <w:fldChar w:fldCharType="begin"/>
+      <w:instrText xml:space="preserve">PAGE</w:instrText>
+      <w:fldChar w:fldCharType="separate"/>
+      <w:t>1</w:t>
+      <w:fldChar w:fldCharType="end"/>
+    </w:r>
+  </w:p>
 </w:ftr>
 </file>
 
 <file path=word/footer10.xml><?xml version="1.0" encoding="utf-8"?>
 <w:ftr xmlns:wpc="http://schemas.microsoft.com/office/word/2010/wordprocessingCanvas" xmlns:mc="http://schemas.openxmlformats.org/markup-compatibility/2006" xmlns:o="urn:schemas-microsoft-com:office:office" xmlns:r="http://schemas.openxmlformats.org/officeDocument/2006/relationships" xmlns:m="http://schemas.openxmlformats.org/officeDocument/2006/math" xmlns:v="urn:schemas-microsoft-com:vml" xmlns:wp14="http://schemas.microsoft.com/office/word/2010/wordprocessingDrawing" xmlns:wp="http://schemas.openxmlformats.org/drawingml/2006/wordprocessingDrawing" xmlns:w10="urn:schemas-microsoft-com:office:word" xmlns:w="http://schemas.openxmlformats.org/wordprocessingml/2006/main" xmlns:w14="http://schemas.microsoft.com/office/word/2010/wordml" xmlns:w15="http://schemas.microsoft.com/office/word/2012/wordml" xmlns:wpg="http://schemas.microsoft.com/office/word/2010/wordprocessingGroup" xmlns:wpi="http://schemas.microsoft.com/office/word/2010/wordprocessingInk" xmlns:wne="http://schemas.microsoft.com/office/word/2006/wordml" xmlns:wps="http://schemas.microsoft.com/office/word/2010/wordprocessingShape">
-  <w:p/>
+  <w:p>
+    <w:pPr>
+      <w:pStyle w:val="Normal"/>
+      <w:jc w:val="center"/>
+    </w:pPr>
+    <w:r>
+      <w:fldChar w:fldCharType="begin"/>
+      <w:instrText xml:space="preserve">PAGE</w:instrText>
+      <w:fldChar w:fldCharType="separate"/>
+      <w:t>1</w:t>
+      <w:fldChar w:fldCharType="end"/>
+    </w:r>
+  </w:p>
 </w:ftr>
 </file>
 
@@ -10121,13 +10145,37 @@
 
 <file path=word/footer12.xml><?xml version="1.0" encoding="utf-8"?>
 <w:ftr xmlns:wpc="http://schemas.microsoft.com/office/word/2010/wordprocessingCanvas" xmlns:mc="http://schemas.openxmlformats.org/markup-compatibility/2006" xmlns:o="urn:schemas-microsoft-com:office:office" xmlns:r="http://schemas.openxmlformats.org/officeDocument/2006/relationships" xmlns:m="http://schemas.openxmlformats.org/officeDocument/2006/math" xmlns:v="urn:schemas-microsoft-com:vml" xmlns:wp14="http://schemas.microsoft.com/office/word/2010/wordprocessingDrawing" xmlns:wp="http://schemas.openxmlformats.org/drawingml/2006/wordprocessingDrawing" xmlns:w10="urn:schemas-microsoft-com:office:word" xmlns:w="http://schemas.openxmlformats.org/wordprocessingml/2006/main" xmlns:w14="http://schemas.microsoft.com/office/word/2010/wordml" xmlns:w15="http://schemas.microsoft.com/office/word/2012/wordml" xmlns:wpg="http://schemas.microsoft.com/office/word/2010/wordprocessingGroup" xmlns:wpi="http://schemas.microsoft.com/office/word/2010/wordprocessingInk" xmlns:wne="http://schemas.microsoft.com/office/word/2006/wordml" xmlns:wps="http://schemas.microsoft.com/office/word/2010/wordprocessingShape">
-  <w:p/>
+  <w:p>
+    <w:pPr>
+      <w:pStyle w:val="Normal"/>
+      <w:jc w:val="center"/>
+    </w:pPr>
+    <w:r>
+      <w:fldChar w:fldCharType="begin"/>
+      <w:instrText xml:space="preserve">PAGE</w:instrText>
+      <w:fldChar w:fldCharType="separate"/>
+      <w:t>1</w:t>
+      <w:fldChar w:fldCharType="end"/>
+    </w:r>
+  </w:p>
 </w:ftr>
 </file>
 
 <file path=word/footer13.xml><?xml version="1.0" encoding="utf-8"?>
 <w:ftr xmlns:wpc="http://schemas.microsoft.com/office/word/2010/wordprocessingCanvas" xmlns:mc="http://schemas.openxmlformats.org/markup-compatibility/2006" xmlns:o="urn:schemas-microsoft-com:office:office" xmlns:r="http://schemas.openxmlformats.org/officeDocument/2006/relationships" xmlns:m="http://schemas.openxmlformats.org/officeDocument/2006/math" xmlns:v="urn:schemas-microsoft-com:vml" xmlns:wp14="http://schemas.microsoft.com/office/word/2010/wordprocessingDrawing" xmlns:wp="http://schemas.openxmlformats.org/drawingml/2006/wordprocessingDrawing" xmlns:w10="urn:schemas-microsoft-com:office:word" xmlns:w="http://schemas.openxmlformats.org/wordprocessingml/2006/main" xmlns:w14="http://schemas.microsoft.com/office/word/2010/wordml" xmlns:w15="http://schemas.microsoft.com/office/word/2012/wordml" xmlns:wpg="http://schemas.microsoft.com/office/word/2010/wordprocessingGroup" xmlns:wpi="http://schemas.microsoft.com/office/word/2010/wordprocessingInk" xmlns:wne="http://schemas.microsoft.com/office/word/2006/wordml" xmlns:wps="http://schemas.microsoft.com/office/word/2010/wordprocessingShape">
-  <w:p/>
+  <w:p>
+    <w:pPr>
+      <w:pStyle w:val="Normal"/>
+      <w:jc w:val="center"/>
+    </w:pPr>
+    <w:r>
+      <w:fldChar w:fldCharType="begin"/>
+      <w:instrText xml:space="preserve">PAGE</w:instrText>
+      <w:fldChar w:fldCharType="separate"/>
+      <w:t>1</w:t>
+      <w:fldChar w:fldCharType="end"/>
+    </w:r>
+  </w:p>
 </w:ftr>
 </file>
 
@@ -10151,13 +10199,37 @@
 
 <file path=word/footer15.xml><?xml version="1.0" encoding="utf-8"?>
 <w:ftr xmlns:wpc="http://schemas.microsoft.com/office/word/2010/wordprocessingCanvas" xmlns:mc="http://schemas.openxmlformats.org/markup-compatibility/2006" xmlns:o="urn:schemas-microsoft-com:office:office" xmlns:r="http://schemas.openxmlformats.org/officeDocument/2006/relationships" xmlns:m="http://schemas.openxmlformats.org/officeDocument/2006/math" xmlns:v="urn:schemas-microsoft-com:vml" xmlns:wp14="http://schemas.microsoft.com/office/word/2010/wordprocessingDrawing" xmlns:wp="http://schemas.openxmlformats.org/drawingml/2006/wordprocessingDrawing" xmlns:w10="urn:schemas-microsoft-com:office:word" xmlns:w="http://schemas.openxmlformats.org/wordprocessingml/2006/main" xmlns:w14="http://schemas.microsoft.com/office/word/2010/wordml" xmlns:w15="http://schemas.microsoft.com/office/word/2012/wordml" xmlns:wpg="http://schemas.microsoft.com/office/word/2010/wordprocessingGroup" xmlns:wpi="http://schemas.microsoft.com/office/word/2010/wordprocessingInk" xmlns:wne="http://schemas.microsoft.com/office/word/2006/wordml" xmlns:wps="http://schemas.microsoft.com/office/word/2010/wordprocessingShape">
-  <w:p/>
+  <w:p>
+    <w:pPr>
+      <w:pStyle w:val="Normal"/>
+      <w:jc w:val="center"/>
+    </w:pPr>
+    <w:r>
+      <w:fldChar w:fldCharType="begin"/>
+      <w:instrText xml:space="preserve">PAGE</w:instrText>
+      <w:fldChar w:fldCharType="separate"/>
+      <w:t>1</w:t>
+      <w:fldChar w:fldCharType="end"/>
+    </w:r>
+  </w:p>
 </w:ftr>
 </file>
 
 <file path=word/footer16.xml><?xml version="1.0" encoding="utf-8"?>
 <w:ftr xmlns:wpc="http://schemas.microsoft.com/office/word/2010/wordprocessingCanvas" xmlns:mc="http://schemas.openxmlformats.org/markup-compatibility/2006" xmlns:o="urn:schemas-microsoft-com:office:office" xmlns:r="http://schemas.openxmlformats.org/officeDocument/2006/relationships" xmlns:m="http://schemas.openxmlformats.org/officeDocument/2006/math" xmlns:v="urn:schemas-microsoft-com:vml" xmlns:wp14="http://schemas.microsoft.com/office/word/2010/wordprocessingDrawing" xmlns:wp="http://schemas.openxmlformats.org/drawingml/2006/wordprocessingDrawing" xmlns:w10="urn:schemas-microsoft-com:office:word" xmlns:w="http://schemas.openxmlformats.org/wordprocessingml/2006/main" xmlns:w14="http://schemas.microsoft.com/office/word/2010/wordml" xmlns:w15="http://schemas.microsoft.com/office/word/2012/wordml" xmlns:wpg="http://schemas.microsoft.com/office/word/2010/wordprocessingGroup" xmlns:wpi="http://schemas.microsoft.com/office/word/2010/wordprocessingInk" xmlns:wne="http://schemas.microsoft.com/office/word/2006/wordml" xmlns:wps="http://schemas.microsoft.com/office/word/2010/wordprocessingShape">
-  <w:p/>
+  <w:p>
+    <w:pPr>
+      <w:pStyle w:val="Normal"/>
+      <w:jc w:val="center"/>
+    </w:pPr>
+    <w:r>
+      <w:fldChar w:fldCharType="begin"/>
+      <w:instrText xml:space="preserve">PAGE</w:instrText>
+      <w:fldChar w:fldCharType="separate"/>
+      <w:t>1</w:t>
+      <w:fldChar w:fldCharType="end"/>
+    </w:r>
+  </w:p>
 </w:ftr>
 </file>
 
@@ -10181,13 +10253,37 @@
 
 <file path=word/footer18.xml><?xml version="1.0" encoding="utf-8"?>
 <w:ftr xmlns:wpc="http://schemas.microsoft.com/office/word/2010/wordprocessingCanvas" xmlns:mc="http://schemas.openxmlformats.org/markup-compatibility/2006" xmlns:o="urn:schemas-microsoft-com:office:office" xmlns:r="http://schemas.openxmlformats.org/officeDocument/2006/relationships" xmlns:m="http://schemas.openxmlformats.org/officeDocument/2006/math" xmlns:v="urn:schemas-microsoft-com:vml" xmlns:wp14="http://schemas.microsoft.com/office/word/2010/wordprocessingDrawing" xmlns:wp="http://schemas.openxmlformats.org/drawingml/2006/wordprocessingDrawing" xmlns:w10="urn:schemas-microsoft-com:office:word" xmlns:w="http://schemas.openxmlformats.org/wordprocessingml/2006/main" xmlns:w14="http://schemas.microsoft.com/office/word/2010/wordml" xmlns:w15="http://schemas.microsoft.com/office/word/2012/wordml" xmlns:wpg="http://schemas.microsoft.com/office/word/2010/wordprocessingGroup" xmlns:wpi="http://schemas.microsoft.com/office/word/2010/wordprocessingInk" xmlns:wne="http://schemas.microsoft.com/office/word/2006/wordml" xmlns:wps="http://schemas.microsoft.com/office/word/2010/wordprocessingShape">
-  <w:p/>
+  <w:p>
+    <w:pPr>
+      <w:pStyle w:val="Normal"/>
+      <w:jc w:val="center"/>
+    </w:pPr>
+    <w:r>
+      <w:fldChar w:fldCharType="begin"/>
+      <w:instrText xml:space="preserve">PAGE</w:instrText>
+      <w:fldChar w:fldCharType="separate"/>
+      <w:t>1</w:t>
+      <w:fldChar w:fldCharType="end"/>
+    </w:r>
+  </w:p>
 </w:ftr>
 </file>
 
 <file path=word/footer19.xml><?xml version="1.0" encoding="utf-8"?>
 <w:ftr xmlns:wpc="http://schemas.microsoft.com/office/word/2010/wordprocessingCanvas" xmlns:mc="http://schemas.openxmlformats.org/markup-compatibility/2006" xmlns:o="urn:schemas-microsoft-com:office:office" xmlns:r="http://schemas.openxmlformats.org/officeDocument/2006/relationships" xmlns:m="http://schemas.openxmlformats.org/officeDocument/2006/math" xmlns:v="urn:schemas-microsoft-com:vml" xmlns:wp14="http://schemas.microsoft.com/office/word/2010/wordprocessingDrawing" xmlns:wp="http://schemas.openxmlformats.org/drawingml/2006/wordprocessingDrawing" xmlns:w10="urn:schemas-microsoft-com:office:word" xmlns:w="http://schemas.openxmlformats.org/wordprocessingml/2006/main" xmlns:w14="http://schemas.microsoft.com/office/word/2010/wordml" xmlns:w15="http://schemas.microsoft.com/office/word/2012/wordml" xmlns:wpg="http://schemas.microsoft.com/office/word/2010/wordprocessingGroup" xmlns:wpi="http://schemas.microsoft.com/office/word/2010/wordprocessingInk" xmlns:wne="http://schemas.microsoft.com/office/word/2006/wordml" xmlns:wps="http://schemas.microsoft.com/office/word/2010/wordprocessingShape">
-  <w:p/>
+  <w:p>
+    <w:pPr>
+      <w:pStyle w:val="Normal"/>
+      <w:jc w:val="center"/>
+    </w:pPr>
+    <w:r>
+      <w:fldChar w:fldCharType="begin"/>
+      <w:instrText xml:space="preserve">PAGE</w:instrText>
+      <w:fldChar w:fldCharType="separate"/>
+      <w:t>1</w:t>
+      <w:fldChar w:fldCharType="end"/>
+    </w:r>
+  </w:p>
 </w:ftr>
 </file>
 
@@ -10229,13 +10325,37 @@
 
 <file path=word/footer21.xml><?xml version="1.0" encoding="utf-8"?>
 <w:ftr xmlns:wpc="http://schemas.microsoft.com/office/word/2010/wordprocessingCanvas" xmlns:mc="http://schemas.openxmlformats.org/markup-compatibility/2006" xmlns:o="urn:schemas-microsoft-com:office:office" xmlns:r="http://schemas.openxmlformats.org/officeDocument/2006/relationships" xmlns:m="http://schemas.openxmlformats.org/officeDocument/2006/math" xmlns:v="urn:schemas-microsoft-com:vml" xmlns:wp14="http://schemas.microsoft.com/office/word/2010/wordprocessingDrawing" xmlns:wp="http://schemas.openxmlformats.org/drawingml/2006/wordprocessingDrawing" xmlns:w10="urn:schemas-microsoft-com:office:word" xmlns:w="http://schemas.openxmlformats.org/wordprocessingml/2006/main" xmlns:w14="http://schemas.microsoft.com/office/word/2010/wordml" xmlns:w15="http://schemas.microsoft.com/office/word/2012/wordml" xmlns:wpg="http://schemas.microsoft.com/office/word/2010/wordprocessingGroup" xmlns:wpi="http://schemas.microsoft.com/office/word/2010/wordprocessingInk" xmlns:wne="http://schemas.microsoft.com/office/word/2006/wordml" xmlns:wps="http://schemas.microsoft.com/office/word/2010/wordprocessingShape">
-  <w:p/>
+  <w:p>
+    <w:pPr>
+      <w:pStyle w:val="Normal"/>
+      <w:jc w:val="center"/>
+    </w:pPr>
+    <w:r>
+      <w:fldChar w:fldCharType="begin"/>
+      <w:instrText xml:space="preserve">PAGE</w:instrText>
+      <w:fldChar w:fldCharType="separate"/>
+      <w:t>1</w:t>
+      <w:fldChar w:fldCharType="end"/>
+    </w:r>
+  </w:p>
 </w:ftr>
 </file>
 
 <file path=word/footer22.xml><?xml version="1.0" encoding="utf-8"?>
 <w:ftr xmlns:wpc="http://schemas.microsoft.com/office/word/2010/wordprocessingCanvas" xmlns:mc="http://schemas.openxmlformats.org/markup-compatibility/2006" xmlns:o="urn:schemas-microsoft-com:office:office" xmlns:r="http://schemas.openxmlformats.org/officeDocument/2006/relationships" xmlns:m="http://schemas.openxmlformats.org/officeDocument/2006/math" xmlns:v="urn:schemas-microsoft-com:vml" xmlns:wp14="http://schemas.microsoft.com/office/word/2010/wordprocessingDrawing" xmlns:wp="http://schemas.openxmlformats.org/drawingml/2006/wordprocessingDrawing" xmlns:w10="urn:schemas-microsoft-com:office:word" xmlns:w="http://schemas.openxmlformats.org/wordprocessingml/2006/main" xmlns:w14="http://schemas.microsoft.com/office/word/2010/wordml" xmlns:w15="http://schemas.microsoft.com/office/word/2012/wordml" xmlns:wpg="http://schemas.microsoft.com/office/word/2010/wordprocessingGroup" xmlns:wpi="http://schemas.microsoft.com/office/word/2010/wordprocessingInk" xmlns:wne="http://schemas.microsoft.com/office/word/2006/wordml" xmlns:wps="http://schemas.microsoft.com/office/word/2010/wordprocessingShape">
-  <w:p/>
+  <w:p>
+    <w:pPr>
+      <w:pStyle w:val="Normal"/>
+      <w:jc w:val="center"/>
+    </w:pPr>
+    <w:r>
+      <w:fldChar w:fldCharType="begin"/>
+      <w:instrText xml:space="preserve">PAGE</w:instrText>
+      <w:fldChar w:fldCharType="separate"/>
+      <w:t>1</w:t>
+      <w:fldChar w:fldCharType="end"/>
+    </w:r>
+  </w:p>
 </w:ftr>
 </file>
 
@@ -10259,13 +10379,37 @@
 
 <file path=word/footer24.xml><?xml version="1.0" encoding="utf-8"?>
 <w:ftr xmlns:wpc="http://schemas.microsoft.com/office/word/2010/wordprocessingCanvas" xmlns:mc="http://schemas.openxmlformats.org/markup-compatibility/2006" xmlns:o="urn:schemas-microsoft-com:office:office" xmlns:r="http://schemas.openxmlformats.org/officeDocument/2006/relationships" xmlns:m="http://schemas.openxmlformats.org/officeDocument/2006/math" xmlns:v="urn:schemas-microsoft-com:vml" xmlns:wp14="http://schemas.microsoft.com/office/word/2010/wordprocessingDrawing" xmlns:wp="http://schemas.openxmlformats.org/drawingml/2006/wordprocessingDrawing" xmlns:w10="urn:schemas-microsoft-com:office:word" xmlns:w="http://schemas.openxmlformats.org/wordprocessingml/2006/main" xmlns:w14="http://schemas.microsoft.com/office/word/2010/wordml" xmlns:w15="http://schemas.microsoft.com/office/word/2012/wordml" xmlns:wpg="http://schemas.microsoft.com/office/word/2010/wordprocessingGroup" xmlns:wpi="http://schemas.microsoft.com/office/word/2010/wordprocessingInk" xmlns:wne="http://schemas.microsoft.com/office/word/2006/wordml" xmlns:wps="http://schemas.microsoft.com/office/word/2010/wordprocessingShape">
-  <w:p/>
+  <w:p>
+    <w:pPr>
+      <w:pStyle w:val="Normal"/>
+      <w:jc w:val="center"/>
+    </w:pPr>
+    <w:r>
+      <w:fldChar w:fldCharType="begin"/>
+      <w:instrText xml:space="preserve">PAGE</w:instrText>
+      <w:fldChar w:fldCharType="separate"/>
+      <w:t>1</w:t>
+      <w:fldChar w:fldCharType="end"/>
+    </w:r>
+  </w:p>
 </w:ftr>
 </file>
 
 <file path=word/footer25.xml><?xml version="1.0" encoding="utf-8"?>
 <w:ftr xmlns:wpc="http://schemas.microsoft.com/office/word/2010/wordprocessingCanvas" xmlns:mc="http://schemas.openxmlformats.org/markup-compatibility/2006" xmlns:o="urn:schemas-microsoft-com:office:office" xmlns:r="http://schemas.openxmlformats.org/officeDocument/2006/relationships" xmlns:m="http://schemas.openxmlformats.org/officeDocument/2006/math" xmlns:v="urn:schemas-microsoft-com:vml" xmlns:wp14="http://schemas.microsoft.com/office/word/2010/wordprocessingDrawing" xmlns:wp="http://schemas.openxmlformats.org/drawingml/2006/wordprocessingDrawing" xmlns:w10="urn:schemas-microsoft-com:office:word" xmlns:w="http://schemas.openxmlformats.org/wordprocessingml/2006/main" xmlns:w14="http://schemas.microsoft.com/office/word/2010/wordml" xmlns:w15="http://schemas.microsoft.com/office/word/2012/wordml" xmlns:wpg="http://schemas.microsoft.com/office/word/2010/wordprocessingGroup" xmlns:wpi="http://schemas.microsoft.com/office/word/2010/wordprocessingInk" xmlns:wne="http://schemas.microsoft.com/office/word/2006/wordml" xmlns:wps="http://schemas.microsoft.com/office/word/2010/wordprocessingShape">
-  <w:p/>
+  <w:p>
+    <w:pPr>
+      <w:pStyle w:val="Normal"/>
+      <w:jc w:val="center"/>
+    </w:pPr>
+    <w:r>
+      <w:fldChar w:fldCharType="begin"/>
+      <w:instrText xml:space="preserve">PAGE</w:instrText>
+      <w:fldChar w:fldCharType="separate"/>
+      <w:t>1</w:t>
+      <w:fldChar w:fldCharType="end"/>
+    </w:r>
+  </w:p>
 </w:ftr>
 </file>
 
@@ -10289,13 +10433,37 @@
 
 <file path=word/footer27.xml><?xml version="1.0" encoding="utf-8"?>
 <w:ftr xmlns:wpc="http://schemas.microsoft.com/office/word/2010/wordprocessingCanvas" xmlns:mc="http://schemas.openxmlformats.org/markup-compatibility/2006" xmlns:o="urn:schemas-microsoft-com:office:office" xmlns:r="http://schemas.openxmlformats.org/officeDocument/2006/relationships" xmlns:m="http://schemas.openxmlformats.org/officeDocument/2006/math" xmlns:v="urn:schemas-microsoft-com:vml" xmlns:wp14="http://schemas.microsoft.com/office/word/2010/wordprocessingDrawing" xmlns:wp="http://schemas.openxmlformats.org/drawingml/2006/wordprocessingDrawing" xmlns:w10="urn:schemas-microsoft-com:office:word" xmlns:w="http://schemas.openxmlformats.org/wordprocessingml/2006/main" xmlns:w14="http://schemas.microsoft.com/office/word/2010/wordml" xmlns:w15="http://schemas.microsoft.com/office/word/2012/wordml" xmlns:wpg="http://schemas.microsoft.com/office/word/2010/wordprocessingGroup" xmlns:wpi="http://schemas.microsoft.com/office/word/2010/wordprocessingInk" xmlns:wne="http://schemas.microsoft.com/office/word/2006/wordml" xmlns:wps="http://schemas.microsoft.com/office/word/2010/wordprocessingShape">
-  <w:p/>
+  <w:p>
+    <w:pPr>
+      <w:pStyle w:val="Normal"/>
+      <w:jc w:val="center"/>
+    </w:pPr>
+    <w:r>
+      <w:fldChar w:fldCharType="begin"/>
+      <w:instrText xml:space="preserve">PAGE</w:instrText>
+      <w:fldChar w:fldCharType="separate"/>
+      <w:t>1</w:t>
+      <w:fldChar w:fldCharType="end"/>
+    </w:r>
+  </w:p>
 </w:ftr>
 </file>
 
 <file path=word/footer28.xml><?xml version="1.0" encoding="utf-8"?>
 <w:ftr xmlns:wpc="http://schemas.microsoft.com/office/word/2010/wordprocessingCanvas" xmlns:mc="http://schemas.openxmlformats.org/markup-compatibility/2006" xmlns:o="urn:schemas-microsoft-com:office:office" xmlns:r="http://schemas.openxmlformats.org/officeDocument/2006/relationships" xmlns:m="http://schemas.openxmlformats.org/officeDocument/2006/math" xmlns:v="urn:schemas-microsoft-com:vml" xmlns:wp14="http://schemas.microsoft.com/office/word/2010/wordprocessingDrawing" xmlns:wp="http://schemas.openxmlformats.org/drawingml/2006/wordprocessingDrawing" xmlns:w10="urn:schemas-microsoft-com:office:word" xmlns:w="http://schemas.openxmlformats.org/wordprocessingml/2006/main" xmlns:w14="http://schemas.microsoft.com/office/word/2010/wordml" xmlns:w15="http://schemas.microsoft.com/office/word/2012/wordml" xmlns:wpg="http://schemas.microsoft.com/office/word/2010/wordprocessingGroup" xmlns:wpi="http://schemas.microsoft.com/office/word/2010/wordprocessingInk" xmlns:wne="http://schemas.microsoft.com/office/word/2006/wordml" xmlns:wps="http://schemas.microsoft.com/office/word/2010/wordprocessingShape">
-  <w:p/>
+  <w:p>
+    <w:pPr>
+      <w:pStyle w:val="Normal"/>
+      <w:jc w:val="center"/>
+    </w:pPr>
+    <w:r>
+      <w:fldChar w:fldCharType="begin"/>
+      <w:instrText xml:space="preserve">PAGE</w:instrText>
+      <w:fldChar w:fldCharType="separate"/>
+      <w:t>1</w:t>
+      <w:fldChar w:fldCharType="end"/>
+    </w:r>
+  </w:p>
 </w:ftr>
 </file>
 
@@ -10319,19 +10487,55 @@
 
 <file path=word/footer3.xml><?xml version="1.0" encoding="utf-8"?>
 <w:ftr xmlns:wpc="http://schemas.microsoft.com/office/word/2010/wordprocessingCanvas" xmlns:mc="http://schemas.openxmlformats.org/markup-compatibility/2006" xmlns:o="urn:schemas-microsoft-com:office:office" xmlns:r="http://schemas.openxmlformats.org/officeDocument/2006/relationships" xmlns:m="http://schemas.openxmlformats.org/officeDocument/2006/math" xmlns:v="urn:schemas-microsoft-com:vml" xmlns:wp14="http://schemas.microsoft.com/office/word/2010/wordprocessingDrawing" xmlns:wp="http://schemas.openxmlformats.org/drawingml/2006/wordprocessingDrawing" xmlns:w10="urn:schemas-microsoft-com:office:word" xmlns:w="http://schemas.openxmlformats.org/wordprocessingml/2006/main" xmlns:w14="http://schemas.microsoft.com/office/word/2010/wordml" xmlns:w15="http://schemas.microsoft.com/office/word/2012/wordml" xmlns:wpg="http://schemas.microsoft.com/office/word/2010/wordprocessingGroup" xmlns:wpi="http://schemas.microsoft.com/office/word/2010/wordprocessingInk" xmlns:wne="http://schemas.microsoft.com/office/word/2006/wordml" xmlns:wps="http://schemas.microsoft.com/office/word/2010/wordprocessingShape">
-  <w:p/>
+  <w:p>
+    <w:pPr>
+      <w:pStyle w:val="Normal"/>
+      <w:jc w:val="center"/>
+    </w:pPr>
+    <w:r>
+      <w:fldChar w:fldCharType="begin"/>
+      <w:instrText xml:space="preserve">PAGE</w:instrText>
+      <w:fldChar w:fldCharType="separate"/>
+      <w:t>1</w:t>
+      <w:fldChar w:fldCharType="end"/>
+    </w:r>
+  </w:p>
 </w:ftr>
 </file>
 
 <file path=word/footer30.xml><?xml version="1.0" encoding="utf-8"?>
 <w:ftr xmlns:wpc="http://schemas.microsoft.com/office/word/2010/wordprocessingCanvas" xmlns:mc="http://schemas.openxmlformats.org/markup-compatibility/2006" xmlns:o="urn:schemas-microsoft-com:office:office" xmlns:r="http://schemas.openxmlformats.org/officeDocument/2006/relationships" xmlns:m="http://schemas.openxmlformats.org/officeDocument/2006/math" xmlns:v="urn:schemas-microsoft-com:vml" xmlns:wp14="http://schemas.microsoft.com/office/word/2010/wordprocessingDrawing" xmlns:wp="http://schemas.openxmlformats.org/drawingml/2006/wordprocessingDrawing" xmlns:w10="urn:schemas-microsoft-com:office:word" xmlns:w="http://schemas.openxmlformats.org/wordprocessingml/2006/main" xmlns:w14="http://schemas.microsoft.com/office/word/2010/wordml" xmlns:w15="http://schemas.microsoft.com/office/word/2012/wordml" xmlns:wpg="http://schemas.microsoft.com/office/word/2010/wordprocessingGroup" xmlns:wpi="http://schemas.microsoft.com/office/word/2010/wordprocessingInk" xmlns:wne="http://schemas.microsoft.com/office/word/2006/wordml" xmlns:wps="http://schemas.microsoft.com/office/word/2010/wordprocessingShape">
-  <w:p/>
+  <w:p>
+    <w:pPr>
+      <w:pStyle w:val="Normal"/>
+      <w:jc w:val="center"/>
+    </w:pPr>
+    <w:r>
+      <w:fldChar w:fldCharType="begin"/>
+      <w:instrText xml:space="preserve">PAGE</w:instrText>
+      <w:fldChar w:fldCharType="separate"/>
+      <w:t>1</w:t>
+      <w:fldChar w:fldCharType="end"/>
+    </w:r>
+  </w:p>
 </w:ftr>
 </file>
 
 <file path=word/footer31.xml><?xml version="1.0" encoding="utf-8"?>
 <w:ftr xmlns:wpc="http://schemas.microsoft.com/office/word/2010/wordprocessingCanvas" xmlns:mc="http://schemas.openxmlformats.org/markup-compatibility/2006" xmlns:o="urn:schemas-microsoft-com:office:office" xmlns:r="http://schemas.openxmlformats.org/officeDocument/2006/relationships" xmlns:m="http://schemas.openxmlformats.org/officeDocument/2006/math" xmlns:v="urn:schemas-microsoft-com:vml" xmlns:wp14="http://schemas.microsoft.com/office/word/2010/wordprocessingDrawing" xmlns:wp="http://schemas.openxmlformats.org/drawingml/2006/wordprocessingDrawing" xmlns:w10="urn:schemas-microsoft-com:office:word" xmlns:w="http://schemas.openxmlformats.org/wordprocessingml/2006/main" xmlns:w14="http://schemas.microsoft.com/office/word/2010/wordml" xmlns:w15="http://schemas.microsoft.com/office/word/2012/wordml" xmlns:wpg="http://schemas.microsoft.com/office/word/2010/wordprocessingGroup" xmlns:wpi="http://schemas.microsoft.com/office/word/2010/wordprocessingInk" xmlns:wne="http://schemas.microsoft.com/office/word/2006/wordml" xmlns:wps="http://schemas.microsoft.com/office/word/2010/wordprocessingShape">
-  <w:p/>
+  <w:p>
+    <w:pPr>
+      <w:pStyle w:val="Normal"/>
+      <w:jc w:val="center"/>
+    </w:pPr>
+    <w:r>
+      <w:fldChar w:fldCharType="begin"/>
+      <w:instrText xml:space="preserve">PAGE</w:instrText>
+      <w:fldChar w:fldCharType="separate"/>
+      <w:t>1</w:t>
+      <w:fldChar w:fldCharType="end"/>
+    </w:r>
+  </w:p>
 </w:ftr>
 </file>
 
@@ -10355,13 +10559,37 @@
 
 <file path=word/footer33.xml><?xml version="1.0" encoding="utf-8"?>
 <w:ftr xmlns:wpc="http://schemas.microsoft.com/office/word/2010/wordprocessingCanvas" xmlns:mc="http://schemas.openxmlformats.org/markup-compatibility/2006" xmlns:o="urn:schemas-microsoft-com:office:office" xmlns:r="http://schemas.openxmlformats.org/officeDocument/2006/relationships" xmlns:m="http://schemas.openxmlformats.org/officeDocument/2006/math" xmlns:v="urn:schemas-microsoft-com:vml" xmlns:wp14="http://schemas.microsoft.com/office/word/2010/wordprocessingDrawing" xmlns:wp="http://schemas.openxmlformats.org/drawingml/2006/wordprocessingDrawing" xmlns:w10="urn:schemas-microsoft-com:office:word" xmlns:w="http://schemas.openxmlformats.org/wordprocessingml/2006/main" xmlns:w14="http://schemas.microsoft.com/office/word/2010/wordml" xmlns:w15="http://schemas.microsoft.com/office/word/2012/wordml" xmlns:wpg="http://schemas.microsoft.com/office/word/2010/wordprocessingGroup" xmlns:wpi="http://schemas.microsoft.com/office/word/2010/wordprocessingInk" xmlns:wne="http://schemas.microsoft.com/office/word/2006/wordml" xmlns:wps="http://schemas.microsoft.com/office/word/2010/wordprocessingShape">
-  <w:p/>
+  <w:p>
+    <w:pPr>
+      <w:pStyle w:val="Normal"/>
+      <w:jc w:val="center"/>
+    </w:pPr>
+    <w:r>
+      <w:fldChar w:fldCharType="begin"/>
+      <w:instrText xml:space="preserve">PAGE</w:instrText>
+      <w:fldChar w:fldCharType="separate"/>
+      <w:t>1</w:t>
+      <w:fldChar w:fldCharType="end"/>
+    </w:r>
+  </w:p>
 </w:ftr>
 </file>
 
 <file path=word/footer34.xml><?xml version="1.0" encoding="utf-8"?>
 <w:ftr xmlns:wpc="http://schemas.microsoft.com/office/word/2010/wordprocessingCanvas" xmlns:mc="http://schemas.openxmlformats.org/markup-compatibility/2006" xmlns:o="urn:schemas-microsoft-com:office:office" xmlns:r="http://schemas.openxmlformats.org/officeDocument/2006/relationships" xmlns:m="http://schemas.openxmlformats.org/officeDocument/2006/math" xmlns:v="urn:schemas-microsoft-com:vml" xmlns:wp14="http://schemas.microsoft.com/office/word/2010/wordprocessingDrawing" xmlns:wp="http://schemas.openxmlformats.org/drawingml/2006/wordprocessingDrawing" xmlns:w10="urn:schemas-microsoft-com:office:word" xmlns:w="http://schemas.openxmlformats.org/wordprocessingml/2006/main" xmlns:w14="http://schemas.microsoft.com/office/word/2010/wordml" xmlns:w15="http://schemas.microsoft.com/office/word/2012/wordml" xmlns:wpg="http://schemas.microsoft.com/office/word/2010/wordprocessingGroup" xmlns:wpi="http://schemas.microsoft.com/office/word/2010/wordprocessingInk" xmlns:wne="http://schemas.microsoft.com/office/word/2006/wordml" xmlns:wps="http://schemas.microsoft.com/office/word/2010/wordprocessingShape">
-  <w:p/>
+  <w:p>
+    <w:pPr>
+      <w:pStyle w:val="Normal"/>
+      <w:jc w:val="center"/>
+    </w:pPr>
+    <w:r>
+      <w:fldChar w:fldCharType="begin"/>
+      <w:instrText xml:space="preserve">PAGE</w:instrText>
+      <w:fldChar w:fldCharType="separate"/>
+      <w:t>1</w:t>
+      <w:fldChar w:fldCharType="end"/>
+    </w:r>
+  </w:p>
 </w:ftr>
 </file>
 
@@ -10385,13 +10613,37 @@
 
 <file path=word/footer36.xml><?xml version="1.0" encoding="utf-8"?>
 <w:ftr xmlns:wpc="http://schemas.microsoft.com/office/word/2010/wordprocessingCanvas" xmlns:mc="http://schemas.openxmlformats.org/markup-compatibility/2006" xmlns:o="urn:schemas-microsoft-com:office:office" xmlns:r="http://schemas.openxmlformats.org/officeDocument/2006/relationships" xmlns:m="http://schemas.openxmlformats.org/officeDocument/2006/math" xmlns:v="urn:schemas-microsoft-com:vml" xmlns:wp14="http://schemas.microsoft.com/office/word/2010/wordprocessingDrawing" xmlns:wp="http://schemas.openxmlformats.org/drawingml/2006/wordprocessingDrawing" xmlns:w10="urn:schemas-microsoft-com:office:word" xmlns:w="http://schemas.openxmlformats.org/wordprocessingml/2006/main" xmlns:w14="http://schemas.microsoft.com/office/word/2010/wordml" xmlns:w15="http://schemas.microsoft.com/office/word/2012/wordml" xmlns:wpg="http://schemas.microsoft.com/office/word/2010/wordprocessingGroup" xmlns:wpi="http://schemas.microsoft.com/office/word/2010/wordprocessingInk" xmlns:wne="http://schemas.microsoft.com/office/word/2006/wordml" xmlns:wps="http://schemas.microsoft.com/office/word/2010/wordprocessingShape">
-  <w:p/>
+  <w:p>
+    <w:pPr>
+      <w:pStyle w:val="Normal"/>
+      <w:jc w:val="center"/>
+    </w:pPr>
+    <w:r>
+      <w:fldChar w:fldCharType="begin"/>
+      <w:instrText xml:space="preserve">PAGE</w:instrText>
+      <w:fldChar w:fldCharType="separate"/>
+      <w:t>1</w:t>
+      <w:fldChar w:fldCharType="end"/>
+    </w:r>
+  </w:p>
 </w:ftr>
 </file>
 
 <file path=word/footer4.xml><?xml version="1.0" encoding="utf-8"?>
 <w:ftr xmlns:wpc="http://schemas.microsoft.com/office/word/2010/wordprocessingCanvas" xmlns:mc="http://schemas.openxmlformats.org/markup-compatibility/2006" xmlns:o="urn:schemas-microsoft-com:office:office" xmlns:r="http://schemas.openxmlformats.org/officeDocument/2006/relationships" xmlns:m="http://schemas.openxmlformats.org/officeDocument/2006/math" xmlns:v="urn:schemas-microsoft-com:vml" xmlns:wp14="http://schemas.microsoft.com/office/word/2010/wordprocessingDrawing" xmlns:wp="http://schemas.openxmlformats.org/drawingml/2006/wordprocessingDrawing" xmlns:w10="urn:schemas-microsoft-com:office:word" xmlns:w="http://schemas.openxmlformats.org/wordprocessingml/2006/main" xmlns:w14="http://schemas.microsoft.com/office/word/2010/wordml" xmlns:w15="http://schemas.microsoft.com/office/word/2012/wordml" xmlns:wpg="http://schemas.microsoft.com/office/word/2010/wordprocessingGroup" xmlns:wpi="http://schemas.microsoft.com/office/word/2010/wordprocessingInk" xmlns:wne="http://schemas.microsoft.com/office/word/2006/wordml" xmlns:wps="http://schemas.microsoft.com/office/word/2010/wordprocessingShape">
-  <w:p/>
+  <w:p>
+    <w:pPr>
+      <w:pStyle w:val="Normal"/>
+      <w:jc w:val="center"/>
+    </w:pPr>
+    <w:r>
+      <w:fldChar w:fldCharType="begin"/>
+      <w:instrText xml:space="preserve">PAGE</w:instrText>
+      <w:fldChar w:fldCharType="separate"/>
+      <w:t>1</w:t>
+      <w:fldChar w:fldCharType="end"/>
+    </w:r>
+  </w:p>
 </w:ftr>
 </file>
 
@@ -10415,13 +10667,37 @@
 
 <file path=word/footer6.xml><?xml version="1.0" encoding="utf-8"?>
 <w:ftr xmlns:wpc="http://schemas.microsoft.com/office/word/2010/wordprocessingCanvas" xmlns:mc="http://schemas.openxmlformats.org/markup-compatibility/2006" xmlns:o="urn:schemas-microsoft-com:office:office" xmlns:r="http://schemas.openxmlformats.org/officeDocument/2006/relationships" xmlns:m="http://schemas.openxmlformats.org/officeDocument/2006/math" xmlns:v="urn:schemas-microsoft-com:vml" xmlns:wp14="http://schemas.microsoft.com/office/word/2010/wordprocessingDrawing" xmlns:wp="http://schemas.openxmlformats.org/drawingml/2006/wordprocessingDrawing" xmlns:w10="urn:schemas-microsoft-com:office:word" xmlns:w="http://schemas.openxmlformats.org/wordprocessingml/2006/main" xmlns:w14="http://schemas.microsoft.com/office/word/2010/wordml" xmlns:w15="http://schemas.microsoft.com/office/word/2012/wordml" xmlns:wpg="http://schemas.microsoft.com/office/word/2010/wordprocessingGroup" xmlns:wpi="http://schemas.microsoft.com/office/word/2010/wordprocessingInk" xmlns:wne="http://schemas.microsoft.com/office/word/2006/wordml" xmlns:wps="http://schemas.microsoft.com/office/word/2010/wordprocessingShape">
-  <w:p/>
+  <w:p>
+    <w:pPr>
+      <w:pStyle w:val="Normal"/>
+      <w:jc w:val="center"/>
+    </w:pPr>
+    <w:r>
+      <w:fldChar w:fldCharType="begin"/>
+      <w:instrText xml:space="preserve">PAGE</w:instrText>
+      <w:fldChar w:fldCharType="separate"/>
+      <w:t>1</w:t>
+      <w:fldChar w:fldCharType="end"/>
+    </w:r>
+  </w:p>
 </w:ftr>
 </file>
 
 <file path=word/footer7.xml><?xml version="1.0" encoding="utf-8"?>
 <w:ftr xmlns:wpc="http://schemas.microsoft.com/office/word/2010/wordprocessingCanvas" xmlns:mc="http://schemas.openxmlformats.org/markup-compatibility/2006" xmlns:o="urn:schemas-microsoft-com:office:office" xmlns:r="http://schemas.openxmlformats.org/officeDocument/2006/relationships" xmlns:m="http://schemas.openxmlformats.org/officeDocument/2006/math" xmlns:v="urn:schemas-microsoft-com:vml" xmlns:wp14="http://schemas.microsoft.com/office/word/2010/wordprocessingDrawing" xmlns:wp="http://schemas.openxmlformats.org/drawingml/2006/wordprocessingDrawing" xmlns:w10="urn:schemas-microsoft-com:office:word" xmlns:w="http://schemas.openxmlformats.org/wordprocessingml/2006/main" xmlns:w14="http://schemas.microsoft.com/office/word/2010/wordml" xmlns:w15="http://schemas.microsoft.com/office/word/2012/wordml" xmlns:wpg="http://schemas.microsoft.com/office/word/2010/wordprocessingGroup" xmlns:wpi="http://schemas.microsoft.com/office/word/2010/wordprocessingInk" xmlns:wne="http://schemas.microsoft.com/office/word/2006/wordml" xmlns:wps="http://schemas.microsoft.com/office/word/2010/wordprocessingShape">
-  <w:p/>
+  <w:p>
+    <w:pPr>
+      <w:pStyle w:val="Normal"/>
+      <w:jc w:val="center"/>
+    </w:pPr>
+    <w:r>
+      <w:fldChar w:fldCharType="begin"/>
+      <w:instrText xml:space="preserve">PAGE</w:instrText>
+      <w:fldChar w:fldCharType="separate"/>
+      <w:t>1</w:t>
+      <w:fldChar w:fldCharType="end"/>
+    </w:r>
+  </w:p>
 </w:ftr>
 </file>
 
@@ -10445,7 +10721,19 @@
 
 <file path=word/footer9.xml><?xml version="1.0" encoding="utf-8"?>
 <w:ftr xmlns:wpc="http://schemas.microsoft.com/office/word/2010/wordprocessingCanvas" xmlns:mc="http://schemas.openxmlformats.org/markup-compatibility/2006" xmlns:o="urn:schemas-microsoft-com:office:office" xmlns:r="http://schemas.openxmlformats.org/officeDocument/2006/relationships" xmlns:m="http://schemas.openxmlformats.org/officeDocument/2006/math" xmlns:v="urn:schemas-microsoft-com:vml" xmlns:wp14="http://schemas.microsoft.com/office/word/2010/wordprocessingDrawing" xmlns:wp="http://schemas.openxmlformats.org/drawingml/2006/wordprocessingDrawing" xmlns:w10="urn:schemas-microsoft-com:office:word" xmlns:w="http://schemas.openxmlformats.org/wordprocessingml/2006/main" xmlns:w14="http://schemas.microsoft.com/office/word/2010/wordml" xmlns:w15="http://schemas.microsoft.com/office/word/2012/wordml" xmlns:wpg="http://schemas.microsoft.com/office/word/2010/wordprocessingGroup" xmlns:wpi="http://schemas.microsoft.com/office/word/2010/wordprocessingInk" xmlns:wne="http://schemas.microsoft.com/office/word/2006/wordml" xmlns:wps="http://schemas.microsoft.com/office/word/2010/wordprocessingShape">
-  <w:p/>
+  <w:p>
+    <w:pPr>
+      <w:pStyle w:val="Normal"/>
+      <w:jc w:val="center"/>
+    </w:pPr>
+    <w:r>
+      <w:fldChar w:fldCharType="begin"/>
+      <w:instrText xml:space="preserve">PAGE</w:instrText>
+      <w:fldChar w:fldCharType="separate"/>
+      <w:t>1</w:t>
+      <w:fldChar w:fldCharType="end"/>
+    </w:r>
+  </w:p>
 </w:ftr>
 </file>
 
@@ -10491,25 +10779,13 @@
   <w:p>
     <w:pPr>
       <w:pStyle w:val="Normal"/>
-      <w:tabs>
-        <w:tab w:val="right" w:pos="6236"/>
-      </w:tabs>
+      <w:jc w:val="right"/>
     </w:pPr>
     <w:fldSimple w:instr="STYLEREF 1 \* MERGEFORMAT">
       <w:r>
         <w:t xml:space="preserve">Down the Rabbit-Hole</w:t>
       </w:r>
     </w:fldSimple>
-    <w:r>
-      <w:tab/>
-    </w:r>
-    <w:r>
-      <w:fldChar w:fldCharType="begin"/>
-      <w:instrText xml:space="preserve">PAGE</w:instrText>
-      <w:fldChar w:fldCharType="separate"/>
-      <w:t>1</w:t>
-      <w:fldChar w:fldCharType="end"/>
-    </w:r>
   </w:p>
 </w:hdr>
 </file>
@@ -10519,25 +10795,13 @@
   <w:p>
     <w:pPr>
       <w:pStyle w:val="Normal"/>
-      <w:tabs>
-        <w:tab w:val="right" w:pos="6236"/>
-      </w:tabs>
+      <w:jc w:val="right"/>
     </w:pPr>
     <w:fldSimple w:instr="STYLEREF 1 \* MERGEFORMAT">
       <w:r>
         <w:t xml:space="preserve">Down the Rabbit-Hole</w:t>
       </w:r>
     </w:fldSimple>
-    <w:r>
-      <w:tab/>
-    </w:r>
-    <w:r>
-      <w:fldChar w:fldCharType="begin"/>
-      <w:instrText xml:space="preserve">PAGE</w:instrText>
-      <w:fldChar w:fldCharType="separate"/>
-      <w:t>1</w:t>
-      <w:fldChar w:fldCharType="end"/>
-    </w:r>
   </w:p>
 </w:hdr>
 </file>
@@ -10553,20 +10817,7 @@
   <w:p>
     <w:pPr>
       <w:pStyle w:val="Normal"/>
-      <w:tabs>
-        <w:tab w:val="right" w:pos="6236"/>
-      </w:tabs>
     </w:pPr>
-    <w:r>
-      <w:fldChar w:fldCharType="begin"/>
-      <w:instrText xml:space="preserve">PAGE</w:instrText>
-      <w:fldChar w:fldCharType="separate"/>
-      <w:t>1</w:t>
-      <w:fldChar w:fldCharType="end"/>
-    </w:r>
-    <w:r>
-      <w:tab/>
-    </w:r>
     <w:r>
       <w:rPr>
         <w:i/>
@@ -10583,25 +10834,13 @@
   <w:p>
     <w:pPr>
       <w:pStyle w:val="Normal"/>
-      <w:tabs>
-        <w:tab w:val="right" w:pos="6236"/>
-      </w:tabs>
+      <w:jc w:val="right"/>
     </w:pPr>
     <w:fldSimple w:instr="STYLEREF 1 \* MERGEFORMAT">
       <w:r>
         <w:t xml:space="preserve">Down the Rabbit-Hole</w:t>
       </w:r>
     </w:fldSimple>
-    <w:r>
-      <w:tab/>
-    </w:r>
-    <w:r>
-      <w:fldChar w:fldCharType="begin"/>
-      <w:instrText xml:space="preserve">PAGE</w:instrText>
-      <w:fldChar w:fldCharType="separate"/>
-      <w:t>1</w:t>
-      <w:fldChar w:fldCharType="end"/>
-    </w:r>
   </w:p>
 </w:hdr>
 </file>
@@ -10617,20 +10856,7 @@
   <w:p>
     <w:pPr>
       <w:pStyle w:val="Normal"/>
-      <w:tabs>
-        <w:tab w:val="right" w:pos="6236"/>
-      </w:tabs>
     </w:pPr>
-    <w:r>
-      <w:fldChar w:fldCharType="begin"/>
-      <w:instrText xml:space="preserve">PAGE</w:instrText>
-      <w:fldChar w:fldCharType="separate"/>
-      <w:t>1</w:t>
-      <w:fldChar w:fldCharType="end"/>
-    </w:r>
-    <w:r>
-      <w:tab/>
-    </w:r>
     <w:r>
       <w:rPr>
         <w:i/>
@@ -10647,25 +10873,13 @@
   <w:p>
     <w:pPr>
       <w:pStyle w:val="Normal"/>
-      <w:tabs>
-        <w:tab w:val="right" w:pos="6236"/>
-      </w:tabs>
+      <w:jc w:val="right"/>
     </w:pPr>
     <w:fldSimple w:instr="STYLEREF 1 \* MERGEFORMAT">
       <w:r>
         <w:t xml:space="preserve">Down the Rabbit-Hole</w:t>
       </w:r>
     </w:fldSimple>
-    <w:r>
-      <w:tab/>
-    </w:r>
-    <w:r>
-      <w:fldChar w:fldCharType="begin"/>
-      <w:instrText xml:space="preserve">PAGE</w:instrText>
-      <w:fldChar w:fldCharType="separate"/>
-      <w:t>1</w:t>
-      <w:fldChar w:fldCharType="end"/>
-    </w:r>
   </w:p>
 </w:hdr>
 </file>
@@ -10681,20 +10895,7 @@
   <w:p>
     <w:pPr>
       <w:pStyle w:val="Normal"/>
-      <w:tabs>
-        <w:tab w:val="right" w:pos="6236"/>
-      </w:tabs>
     </w:pPr>
-    <w:r>
-      <w:fldChar w:fldCharType="begin"/>
-      <w:instrText xml:space="preserve">PAGE</w:instrText>
-      <w:fldChar w:fldCharType="separate"/>
-      <w:t>1</w:t>
-      <w:fldChar w:fldCharType="end"/>
-    </w:r>
-    <w:r>
-      <w:tab/>
-    </w:r>
     <w:r>
       <w:rPr>
         <w:i/>
@@ -10711,25 +10912,13 @@
   <w:p>
     <w:pPr>
       <w:pStyle w:val="Normal"/>
-      <w:tabs>
-        <w:tab w:val="right" w:pos="6236"/>
-      </w:tabs>
+      <w:jc w:val="right"/>
     </w:pPr>
     <w:fldSimple w:instr="STYLEREF 1 \* MERGEFORMAT">
       <w:r>
         <w:t xml:space="preserve">Down the Rabbit-Hole</w:t>
       </w:r>
     </w:fldSimple>
-    <w:r>
-      <w:tab/>
-    </w:r>
-    <w:r>
-      <w:fldChar w:fldCharType="begin"/>
-      <w:instrText xml:space="preserve">PAGE</w:instrText>
-      <w:fldChar w:fldCharType="separate"/>
-      <w:t>1</w:t>
-      <w:fldChar w:fldCharType="end"/>
-    </w:r>
   </w:p>
 </w:hdr>
 </file>
@@ -10751,20 +10940,7 @@
   <w:p>
     <w:pPr>
       <w:pStyle w:val="Normal"/>
-      <w:tabs>
-        <w:tab w:val="right" w:pos="6236"/>
-      </w:tabs>
     </w:pPr>
-    <w:r>
-      <w:fldChar w:fldCharType="begin"/>
-      <w:instrText xml:space="preserve">PAGE</w:instrText>
-      <w:fldChar w:fldCharType="separate"/>
-      <w:t>1</w:t>
-      <w:fldChar w:fldCharType="end"/>
-    </w:r>
-    <w:r>
-      <w:tab/>
-    </w:r>
     <w:r>
       <w:rPr>
         <w:i/>
@@ -10781,25 +10957,13 @@
   <w:p>
     <w:pPr>
       <w:pStyle w:val="Normal"/>
-      <w:tabs>
-        <w:tab w:val="right" w:pos="6236"/>
-      </w:tabs>
+      <w:jc w:val="right"/>
     </w:pPr>
     <w:fldSimple w:instr="STYLEREF 1 \* MERGEFORMAT">
       <w:r>
         <w:t xml:space="preserve">Down the Rabbit-Hole</w:t>
       </w:r>
     </w:fldSimple>
-    <w:r>
-      <w:tab/>
-    </w:r>
-    <w:r>
-      <w:fldChar w:fldCharType="begin"/>
-      <w:instrText xml:space="preserve">PAGE</w:instrText>
-      <w:fldChar w:fldCharType="separate"/>
-      <w:t>1</w:t>
-      <w:fldChar w:fldCharType="end"/>
-    </w:r>
   </w:p>
 </w:hdr>
 </file>
@@ -10815,20 +10979,7 @@
   <w:p>
     <w:pPr>
       <w:pStyle w:val="Normal"/>
-      <w:tabs>
-        <w:tab w:val="right" w:pos="6236"/>
-      </w:tabs>
     </w:pPr>
-    <w:r>
-      <w:fldChar w:fldCharType="begin"/>
-      <w:instrText xml:space="preserve">PAGE</w:instrText>
-      <w:fldChar w:fldCharType="separate"/>
-      <w:t>1</w:t>
-      <w:fldChar w:fldCharType="end"/>
-    </w:r>
-    <w:r>
-      <w:tab/>
-    </w:r>
     <w:r>
       <w:rPr>
         <w:i/>
@@ -10845,25 +10996,13 @@
   <w:p>
     <w:pPr>
       <w:pStyle w:val="Normal"/>
-      <w:tabs>
-        <w:tab w:val="right" w:pos="6236"/>
-      </w:tabs>
+      <w:jc w:val="right"/>
     </w:pPr>
     <w:fldSimple w:instr="STYLEREF 1 \* MERGEFORMAT">
       <w:r>
         <w:t xml:space="preserve">Down the Rabbit-Hole</w:t>
       </w:r>
     </w:fldSimple>
-    <w:r>
-      <w:tab/>
-    </w:r>
-    <w:r>
-      <w:fldChar w:fldCharType="begin"/>
-      <w:instrText xml:space="preserve">PAGE</w:instrText>
-      <w:fldChar w:fldCharType="separate"/>
-      <w:t>1</w:t>
-      <w:fldChar w:fldCharType="end"/>
-    </w:r>
   </w:p>
 </w:hdr>
 </file>
@@ -10879,20 +11018,7 @@
   <w:p>
     <w:pPr>
       <w:pStyle w:val="Normal"/>
-      <w:tabs>
-        <w:tab w:val="right" w:pos="6236"/>
-      </w:tabs>
     </w:pPr>
-    <w:r>
-      <w:fldChar w:fldCharType="begin"/>
-      <w:instrText xml:space="preserve">PAGE</w:instrText>
-      <w:fldChar w:fldCharType="separate"/>
-      <w:t>1</w:t>
-      <w:fldChar w:fldCharType="end"/>
-    </w:r>
-    <w:r>
-      <w:tab/>
-    </w:r>
     <w:r>
       <w:rPr>
         <w:i/>
@@ -10909,25 +11035,13 @@
   <w:p>
     <w:pPr>
       <w:pStyle w:val="Normal"/>
-      <w:tabs>
-        <w:tab w:val="right" w:pos="6236"/>
-      </w:tabs>
+      <w:jc w:val="right"/>
     </w:pPr>
     <w:fldSimple w:instr="STYLEREF 1 \* MERGEFORMAT">
       <w:r>
         <w:t xml:space="preserve">Down the Rabbit-Hole</w:t>
       </w:r>
     </w:fldSimple>
-    <w:r>
-      <w:tab/>
-    </w:r>
-    <w:r>
-      <w:fldChar w:fldCharType="begin"/>
-      <w:instrText xml:space="preserve">PAGE</w:instrText>
-      <w:fldChar w:fldCharType="separate"/>
-      <w:t>1</w:t>
-      <w:fldChar w:fldCharType="end"/>
-    </w:r>
   </w:p>
 </w:hdr>
 </file>
@@ -10943,20 +11057,7 @@
   <w:p>
     <w:pPr>
       <w:pStyle w:val="Normal"/>
-      <w:tabs>
-        <w:tab w:val="right" w:pos="6236"/>
-      </w:tabs>
     </w:pPr>
-    <w:r>
-      <w:fldChar w:fldCharType="begin"/>
-      <w:instrText xml:space="preserve">PAGE</w:instrText>
-      <w:fldChar w:fldCharType="separate"/>
-      <w:t>1</w:t>
-      <w:fldChar w:fldCharType="end"/>
-    </w:r>
-    <w:r>
-      <w:tab/>
-    </w:r>
     <w:r>
       <w:rPr>
         <w:i/>
@@ -10973,20 +11074,7 @@
   <w:p>
     <w:pPr>
       <w:pStyle w:val="Normal"/>
-      <w:tabs>
-        <w:tab w:val="right" w:pos="6236"/>
-      </w:tabs>
     </w:pPr>
-    <w:r>
-      <w:fldChar w:fldCharType="begin"/>
-      <w:instrText xml:space="preserve">PAGE</w:instrText>
-      <w:fldChar w:fldCharType="separate"/>
-      <w:t>1</w:t>
-      <w:fldChar w:fldCharType="end"/>
-    </w:r>
-    <w:r>
-      <w:tab/>
-    </w:r>
     <w:r>
       <w:rPr>
         <w:i/>
@@ -11003,25 +11091,13 @@
   <w:p>
     <w:pPr>
       <w:pStyle w:val="Normal"/>
-      <w:tabs>
-        <w:tab w:val="right" w:pos="6236"/>
-      </w:tabs>
+      <w:jc w:val="right"/>
     </w:pPr>
     <w:fldSimple w:instr="STYLEREF 1 \* MERGEFORMAT">
       <w:r>
         <w:t xml:space="preserve">Down the Rabbit-Hole</w:t>
       </w:r>
     </w:fldSimple>
-    <w:r>
-      <w:tab/>
-    </w:r>
-    <w:r>
-      <w:fldChar w:fldCharType="begin"/>
-      <w:instrText xml:space="preserve">PAGE</w:instrText>
-      <w:fldChar w:fldCharType="separate"/>
-      <w:t>1</w:t>
-      <w:fldChar w:fldCharType="end"/>
-    </w:r>
   </w:p>
 </w:hdr>
 </file>
@@ -11037,20 +11113,7 @@
   <w:p>
     <w:pPr>
       <w:pStyle w:val="Normal"/>
-      <w:tabs>
-        <w:tab w:val="right" w:pos="6236"/>
-      </w:tabs>
     </w:pPr>
-    <w:r>
-      <w:fldChar w:fldCharType="begin"/>
-      <w:instrText xml:space="preserve">PAGE</w:instrText>
-      <w:fldChar w:fldCharType="separate"/>
-      <w:t>1</w:t>
-      <w:fldChar w:fldCharType="end"/>
-    </w:r>
-    <w:r>
-      <w:tab/>
-    </w:r>
     <w:r>
       <w:rPr>
         <w:i/>
@@ -11067,25 +11130,13 @@
   <w:p>
     <w:pPr>
       <w:pStyle w:val="Normal"/>
-      <w:tabs>
-        <w:tab w:val="right" w:pos="6236"/>
-      </w:tabs>
+      <w:jc w:val="right"/>
     </w:pPr>
     <w:fldSimple w:instr="STYLEREF 1 \* MERGEFORMAT">
       <w:r>
         <w:t xml:space="preserve">Down the Rabbit-Hole</w:t>
       </w:r>
     </w:fldSimple>
-    <w:r>
-      <w:tab/>
-    </w:r>
-    <w:r>
-      <w:fldChar w:fldCharType="begin"/>
-      <w:instrText xml:space="preserve">PAGE</w:instrText>
-      <w:fldChar w:fldCharType="separate"/>
-      <w:t>1</w:t>
-      <w:fldChar w:fldCharType="end"/>
-    </w:r>
   </w:p>
 </w:hdr>
 </file>
@@ -11101,20 +11152,7 @@
   <w:p>
     <w:pPr>
       <w:pStyle w:val="Normal"/>
-      <w:tabs>
-        <w:tab w:val="right" w:pos="6236"/>
-      </w:tabs>
     </w:pPr>
-    <w:r>
-      <w:fldChar w:fldCharType="begin"/>
-      <w:instrText xml:space="preserve">PAGE</w:instrText>
-      <w:fldChar w:fldCharType="separate"/>
-      <w:t>1</w:t>
-      <w:fldChar w:fldCharType="end"/>
-    </w:r>
-    <w:r>
-      <w:tab/>
-    </w:r>
     <w:r>
       <w:rPr>
         <w:i/>
@@ -11131,25 +11169,13 @@
   <w:p>
     <w:pPr>
       <w:pStyle w:val="Normal"/>
-      <w:tabs>
-        <w:tab w:val="right" w:pos="6236"/>
-      </w:tabs>
+      <w:jc w:val="right"/>
     </w:pPr>
     <w:fldSimple w:instr="STYLEREF 1 \* MERGEFORMAT">
       <w:r>
         <w:t xml:space="preserve">Down the Rabbit-Hole</w:t>
       </w:r>
     </w:fldSimple>
-    <w:r>
-      <w:tab/>
-    </w:r>
-    <w:r>
-      <w:fldChar w:fldCharType="begin"/>
-      <w:instrText xml:space="preserve">PAGE</w:instrText>
-      <w:fldChar w:fldCharType="separate"/>
-      <w:t>1</w:t>
-      <w:fldChar w:fldCharType="end"/>
-    </w:r>
   </w:p>
 </w:hdr>
 </file>
@@ -11165,20 +11191,7 @@
   <w:p>
     <w:pPr>
       <w:pStyle w:val="Normal"/>
-      <w:tabs>
-        <w:tab w:val="right" w:pos="6236"/>
-      </w:tabs>
     </w:pPr>
-    <w:r>
-      <w:fldChar w:fldCharType="begin"/>
-      <w:instrText xml:space="preserve">PAGE</w:instrText>
-      <w:fldChar w:fldCharType="separate"/>
-      <w:t>1</w:t>
-      <w:fldChar w:fldCharType="end"/>
-    </w:r>
-    <w:r>
-      <w:tab/>
-    </w:r>
     <w:r>
       <w:rPr>
         <w:i/>
@@ -11195,25 +11208,13 @@
   <w:p>
     <w:pPr>
       <w:pStyle w:val="Normal"/>
-      <w:tabs>
-        <w:tab w:val="right" w:pos="6236"/>
-      </w:tabs>
+      <w:jc w:val="right"/>
     </w:pPr>
     <w:fldSimple w:instr="STYLEREF 1 \* MERGEFORMAT">
       <w:r>
         <w:t xml:space="preserve">Down the Rabbit-Hole</w:t>
       </w:r>
     </w:fldSimple>
-    <w:r>
-      <w:tab/>
-    </w:r>
-    <w:r>
-      <w:fldChar w:fldCharType="begin"/>
-      <w:instrText xml:space="preserve">PAGE</w:instrText>
-      <w:fldChar w:fldCharType="separate"/>
-      <w:t>1</w:t>
-      <w:fldChar w:fldCharType="end"/>
-    </w:r>
   </w:p>
 </w:hdr>
 </file>
@@ -11229,20 +11230,7 @@
   <w:p>
     <w:pPr>
       <w:pStyle w:val="Normal"/>
-      <w:tabs>
-        <w:tab w:val="right" w:pos="6236"/>
-      </w:tabs>
     </w:pPr>
-    <w:r>
-      <w:fldChar w:fldCharType="begin"/>
-      <w:instrText xml:space="preserve">PAGE</w:instrText>
-      <w:fldChar w:fldCharType="separate"/>
-      <w:t>1</w:t>
-      <w:fldChar w:fldCharType="end"/>
-    </w:r>
-    <w:r>
-      <w:tab/>
-    </w:r>
     <w:r>
       <w:rPr>
         <w:i/>

</xml_diff>